<commit_message>
FEAT: Animations and new layout implemented
</commit_message>
<xml_diff>
--- a/markdowns/docs/NotesApp_Feature_Requests.docx
+++ b/markdowns/docs/NotesApp_Feature_Requests.docx
@@ -6232,6 +6232,382 @@
                 <w:szCs w:val="18"/>
               </w:rPr>
               <w:t xml:space="preserve">Chat Screen / Typeset</w:t>
+            </w:r>
+          </w:p>
+        </w:tc>
+      </w:tr>
+      <w:tr>
+        <w:trPr>
+          <w:tblHeader w:val="false"/>
+        </w:trPr>
+        <w:tc>
+          <w:tcPr>
+            <w:tcW w:type="dxa" w:w="600"/>
+            <w:tcBorders>
+              <w:top w:val="single" w:color="E0E0E0" w:sz="1"/>
+              <w:left w:val="single" w:color="E0E0E0" w:sz="1"/>
+              <w:bottom w:val="single" w:color="E0E0E0" w:sz="1"/>
+              <w:right w:val="single" w:color="E0E0E0" w:sz="1"/>
+            </w:tcBorders>
+            <w:shd w:fill="F5F5F5" w:val="clear"/>
+            <w:tcMar>
+              <w:top w:type="dxa" w:w="60"/>
+              <w:left w:type="dxa" w:w="120"/>
+              <w:bottom w:type="dxa" w:w="60"/>
+              <w:right w:type="dxa" w:w="120"/>
+            </w:tcMar>
+          </w:tcPr>
+          <w:p>
+            <w:pPr>
+              <w:spacing w:after="120" w:before="0"/>
+              <w:jc w:val="left"/>
+            </w:pPr>
+            <w:r>
+              <w:rPr>
+                <w:rFonts w:ascii="Arial" w:cs="Arial" w:eastAsia="Arial" w:hAnsi="Arial"/>
+                <w:b w:val="false"/>
+                <w:bCs w:val="false"/>
+                <w:i w:val="false"/>
+                <w:iCs w:val="false"/>
+                <w:color w:val="1A3A5C"/>
+                <w:sz w:val="18"/>
+                <w:szCs w:val="18"/>
+              </w:rPr>
+              <w:t>#32</w:t>
+            </w:r>
+          </w:p>
+        </w:tc>
+        <w:tc>
+          <w:tcPr>
+            <w:tcW w:type="dxa" w:w="3400"/>
+            <w:tcBorders>
+              <w:top w:val="single" w:color="E0E0E0" w:sz="1"/>
+              <w:left w:val="single" w:color="E0E0E0" w:sz="1"/>
+              <w:bottom w:val="single" w:color="E0E0E0" w:sz="1"/>
+              <w:right w:val="single" w:color="E0E0E0" w:sz="1"/>
+            </w:tcBorders>
+            <w:shd w:fill="FFFFFF" w:val="clear"/>
+            <w:tcMar>
+              <w:top w:type="dxa" w:w="60"/>
+              <w:left w:type="dxa" w:w="120"/>
+              <w:bottom w:type="dxa" w:w="60"/>
+              <w:right w:type="dxa" w:w="120"/>
+            </w:tcMar>
+          </w:tcPr>
+          <w:p>
+            <w:pPr>
+              <w:spacing w:after="120" w:before="0"/>
+              <w:jc w:val="left"/>
+            </w:pPr>
+            <w:r>
+              <w:rPr>
+                <w:rFonts w:ascii="Arial" w:cs="Arial" w:eastAsia="Arial" w:hAnsi="Arial"/>
+                <w:b w:val="false"/>
+                <w:bCs w:val="false"/>
+                <w:i w:val="false"/>
+                <w:iCs w:val="false"/>
+                <w:color w:val="000000"/>
+                <w:sz w:val="18"/>
+                <w:szCs w:val="18"/>
+              </w:rPr>
+              <w:t>Deleting a chat image deletes the original source file outside app storage (data loss); ingested media not always copied into Media/, and DB/media split across roots</w:t>
+            </w:r>
+          </w:p>
+        </w:tc>
+        <w:tc>
+          <w:tcPr>
+            <w:tcW w:type="dxa" w:w="1000"/>
+            <w:tcBorders>
+              <w:top w:val="single" w:color="E0E0E0" w:sz="1"/>
+              <w:left w:val="single" w:color="E0E0E0" w:sz="1"/>
+              <w:bottom w:val="single" w:color="E0E0E0" w:sz="1"/>
+              <w:right w:val="single" w:color="E0E0E0" w:sz="1"/>
+            </w:tcBorders>
+            <w:shd w:fill="FFFFFF" w:val="clear"/>
+            <w:tcMar>
+              <w:top w:type="dxa" w:w="60"/>
+              <w:left w:type="dxa" w:w="120"/>
+              <w:bottom w:type="dxa" w:w="60"/>
+              <w:right w:type="dxa" w:w="120"/>
+            </w:tcMar>
+          </w:tcPr>
+          <w:p>
+            <w:pPr>
+              <w:spacing w:after="120" w:before="0"/>
+              <w:jc w:val="left"/>
+            </w:pPr>
+            <w:r>
+              <w:rPr>
+                <w:rFonts w:ascii="Arial" w:cs="Arial" w:eastAsia="Arial" w:hAnsi="Arial"/>
+                <w:b/>
+                <w:bCs/>
+                <w:color w:val="FFFFFF"/>
+                <w:sz w:val="16"/>
+                <w:szCs w:val="16"/>
+                <w:shd w:fill="C62828" w:val="clear"/>
+              </w:rPr>
+              <w:t>Bug</w:t>
+            </w:r>
+          </w:p>
+        </w:tc>
+        <w:tc>
+          <w:tcPr>
+            <w:tcW w:type="dxa" w:w="1560"/>
+            <w:tcBorders>
+              <w:top w:val="single" w:color="E0E0E0" w:sz="1"/>
+              <w:left w:val="single" w:color="E0E0E0" w:sz="1"/>
+              <w:bottom w:val="single" w:color="E0E0E0" w:sz="1"/>
+              <w:right w:val="single" w:color="E0E0E0" w:sz="1"/>
+            </w:tcBorders>
+            <w:shd w:fill="FFFFFF" w:val="clear"/>
+            <w:tcMar>
+              <w:top w:type="dxa" w:w="60"/>
+              <w:left w:type="dxa" w:w="120"/>
+              <w:bottom w:type="dxa" w:w="60"/>
+              <w:right w:type="dxa" w:w="120"/>
+            </w:tcMar>
+          </w:tcPr>
+          <w:p>
+            <w:pPr>
+              <w:spacing w:after="120" w:before="0"/>
+              <w:jc w:val="left"/>
+            </w:pPr>
+            <w:r>
+              <w:rPr>
+                <w:rFonts w:ascii="Arial" w:cs="Arial" w:eastAsia="Arial" w:hAnsi="Arial"/>
+                <w:b/>
+                <w:bCs/>
+                <w:color w:val="FFFFFF"/>
+                <w:sz w:val="16"/>
+                <w:szCs w:val="16"/>
+                <w:shd w:fill="1565C0" w:val="clear"/>
+              </w:rPr>
+              <w:t>P0</w:t>
+            </w:r>
+          </w:p>
+        </w:tc>
+        <w:tc>
+          <w:tcPr>
+            <w:tcW w:type="dxa" w:w="2200"/>
+            <w:tcBorders>
+              <w:top w:val="single" w:color="E0E0E0" w:sz="1"/>
+              <w:left w:val="single" w:color="E0E0E0" w:sz="1"/>
+              <w:bottom w:val="single" w:color="E0E0E0" w:sz="1"/>
+              <w:right w:val="single" w:color="E0E0E0" w:sz="1"/>
+            </w:tcBorders>
+            <w:shd w:fill="F5F5F5" w:val="clear"/>
+            <w:tcMar>
+              <w:top w:type="dxa" w:w="60"/>
+              <w:left w:type="dxa" w:w="120"/>
+              <w:bottom w:type="dxa" w:w="60"/>
+              <w:right w:type="dxa" w:w="120"/>
+            </w:tcMar>
+          </w:tcPr>
+          <w:p>
+            <w:pPr>
+              <w:spacing w:after="120" w:before="0"/>
+              <w:jc w:val="left"/>
+            </w:pPr>
+            <w:r>
+              <w:rPr>
+                <w:rFonts w:ascii="Arial" w:cs="Arial" w:eastAsia="Arial" w:hAnsi="Arial"/>
+                <w:b w:val="false"/>
+                <w:bCs w:val="false"/>
+                <w:i w:val="false"/>
+                <w:iCs w:val="false"/>
+                <w:color w:val="424242"/>
+                <w:sz w:val="18"/>
+                <w:szCs w:val="18"/>
+              </w:rPr>
+              <w:t>Media / Storage</w:t>
+            </w:r>
+          </w:p>
+        </w:tc>
+      </w:tr>
+      <w:tr>
+        <w:trPr>
+          <w:tblHeader w:val="false"/>
+        </w:trPr>
+        <w:tc>
+          <w:tcPr>
+            <w:tcW w:type="dxa" w:w="600"/>
+            <w:tcBorders>
+              <w:top w:val="single" w:color="E0E0E0" w:sz="1"/>
+              <w:left w:val="single" w:color="E0E0E0" w:sz="1"/>
+              <w:bottom w:val="single" w:color="E0E0E0" w:sz="1"/>
+              <w:right w:val="single" w:color="E0E0E0" w:sz="1"/>
+            </w:tcBorders>
+            <w:shd w:fill="F5F5F5" w:val="clear"/>
+            <w:tcMar>
+              <w:top w:type="dxa" w:w="60"/>
+              <w:left w:type="dxa" w:w="120"/>
+              <w:bottom w:type="dxa" w:w="60"/>
+              <w:right w:type="dxa" w:w="120"/>
+            </w:tcMar>
+          </w:tcPr>
+          <w:p>
+            <w:pPr>
+              <w:spacing w:after="120" w:before="0"/>
+              <w:jc w:val="left"/>
+            </w:pPr>
+            <w:r>
+              <w:rPr>
+                <w:rFonts w:ascii="Arial" w:cs="Arial" w:eastAsia="Arial" w:hAnsi="Arial"/>
+                <w:b w:val="false"/>
+                <w:bCs w:val="false"/>
+                <w:i w:val="false"/>
+                <w:iCs w:val="false"/>
+                <w:color w:val="1A3A5C"/>
+                <w:sz w:val="18"/>
+                <w:szCs w:val="18"/>
+              </w:rPr>
+              <w:t>#33</w:t>
+            </w:r>
+          </w:p>
+        </w:tc>
+        <w:tc>
+          <w:tcPr>
+            <w:tcW w:type="dxa" w:w="3400"/>
+            <w:tcBorders>
+              <w:top w:val="single" w:color="E0E0E0" w:sz="1"/>
+              <w:left w:val="single" w:color="E0E0E0" w:sz="1"/>
+              <w:bottom w:val="single" w:color="E0E0E0" w:sz="1"/>
+              <w:right w:val="single" w:color="E0E0E0" w:sz="1"/>
+            </w:tcBorders>
+            <w:shd w:fill="FFFFFF" w:val="clear"/>
+            <w:tcMar>
+              <w:top w:type="dxa" w:w="60"/>
+              <w:left w:type="dxa" w:w="120"/>
+              <w:bottom w:type="dxa" w:w="60"/>
+              <w:right w:type="dxa" w:w="120"/>
+            </w:tcMar>
+          </w:tcPr>
+          <w:p>
+            <w:pPr>
+              <w:spacing w:after="120" w:before="0"/>
+              <w:jc w:val="left"/>
+            </w:pPr>
+            <w:r>
+              <w:rPr>
+                <w:rFonts w:ascii="Arial" w:cs="Arial" w:eastAsia="Arial" w:hAnsi="Arial"/>
+                <w:b w:val="false"/>
+                <w:bCs w:val="false"/>
+                <w:i w:val="false"/>
+                <w:iCs w:val="false"/>
+                <w:color w:val="000000"/>
+                <w:sz w:val="18"/>
+                <w:szCs w:val="18"/>
+              </w:rPr>
+              <w:t>Image captions: per-image caption for a single image AND one shared caption for an album (stored on Message.text; shown in bubble + chat-tile preview)</w:t>
+            </w:r>
+          </w:p>
+        </w:tc>
+        <w:tc>
+          <w:tcPr>
+            <w:tcW w:type="dxa" w:w="1000"/>
+            <w:tcBorders>
+              <w:top w:val="single" w:color="E0E0E0" w:sz="1"/>
+              <w:left w:val="single" w:color="E0E0E0" w:sz="1"/>
+              <w:bottom w:val="single" w:color="E0E0E0" w:sz="1"/>
+              <w:right w:val="single" w:color="E0E0E0" w:sz="1"/>
+            </w:tcBorders>
+            <w:shd w:fill="FFFFFF" w:val="clear"/>
+            <w:tcMar>
+              <w:top w:type="dxa" w:w="60"/>
+              <w:left w:type="dxa" w:w="120"/>
+              <w:bottom w:type="dxa" w:w="60"/>
+              <w:right w:type="dxa" w:w="120"/>
+            </w:tcMar>
+          </w:tcPr>
+          <w:p>
+            <w:pPr>
+              <w:spacing w:after="120" w:before="0"/>
+              <w:jc w:val="left"/>
+            </w:pPr>
+            <w:r>
+              <w:rPr>
+                <w:rFonts w:ascii="Arial" w:cs="Arial" w:eastAsia="Arial" w:hAnsi="Arial"/>
+                <w:b/>
+                <w:bCs/>
+                <w:color w:val="FFFFFF"/>
+                <w:sz w:val="16"/>
+                <w:szCs w:val="16"/>
+                <w:shd w:fill="C62828" w:val="clear"/>
+              </w:rPr>
+              <w:t>Feature</w:t>
+            </w:r>
+          </w:p>
+        </w:tc>
+        <w:tc>
+          <w:tcPr>
+            <w:tcW w:type="dxa" w:w="1560"/>
+            <w:tcBorders>
+              <w:top w:val="single" w:color="E0E0E0" w:sz="1"/>
+              <w:left w:val="single" w:color="E0E0E0" w:sz="1"/>
+              <w:bottom w:val="single" w:color="E0E0E0" w:sz="1"/>
+              <w:right w:val="single" w:color="E0E0E0" w:sz="1"/>
+            </w:tcBorders>
+            <w:shd w:fill="FFFFFF" w:val="clear"/>
+            <w:tcMar>
+              <w:top w:type="dxa" w:w="60"/>
+              <w:left w:type="dxa" w:w="120"/>
+              <w:bottom w:type="dxa" w:w="60"/>
+              <w:right w:type="dxa" w:w="120"/>
+            </w:tcMar>
+          </w:tcPr>
+          <w:p>
+            <w:pPr>
+              <w:spacing w:after="120" w:before="0"/>
+              <w:jc w:val="left"/>
+            </w:pPr>
+            <w:r>
+              <w:rPr>
+                <w:rFonts w:ascii="Arial" w:cs="Arial" w:eastAsia="Arial" w:hAnsi="Arial"/>
+                <w:b/>
+                <w:bCs/>
+                <w:color w:val="FFFFFF"/>
+                <w:sz w:val="16"/>
+                <w:szCs w:val="16"/>
+                <w:shd w:fill="1565C0" w:val="clear"/>
+              </w:rPr>
+              <w:t>P2</w:t>
+            </w:r>
+          </w:p>
+        </w:tc>
+        <w:tc>
+          <w:tcPr>
+            <w:tcW w:type="dxa" w:w="2200"/>
+            <w:tcBorders>
+              <w:top w:val="single" w:color="E0E0E0" w:sz="1"/>
+              <w:left w:val="single" w:color="E0E0E0" w:sz="1"/>
+              <w:bottom w:val="single" w:color="E0E0E0" w:sz="1"/>
+              <w:right w:val="single" w:color="E0E0E0" w:sz="1"/>
+            </w:tcBorders>
+            <w:shd w:fill="F5F5F5" w:val="clear"/>
+            <w:tcMar>
+              <w:top w:type="dxa" w:w="60"/>
+              <w:left w:type="dxa" w:w="120"/>
+              <w:bottom w:type="dxa" w:w="60"/>
+              <w:right w:type="dxa" w:w="120"/>
+            </w:tcMar>
+          </w:tcPr>
+          <w:p>
+            <w:pPr>
+              <w:spacing w:after="120" w:before="0"/>
+              <w:jc w:val="left"/>
+            </w:pPr>
+            <w:r>
+              <w:rPr>
+                <w:rFonts w:ascii="Arial" w:cs="Arial" w:eastAsia="Arial" w:hAnsi="Arial"/>
+                <w:b w:val="false"/>
+                <w:bCs w:val="false"/>
+                <w:i w:val="false"/>
+                <w:iCs w:val="false"/>
+                <w:color w:val="424242"/>
+                <w:sz w:val="18"/>
+                <w:szCs w:val="18"/>
+              </w:rPr>
+              <w:t>Chat Screen / Media</w:t>
             </w:r>
           </w:p>
         </w:tc>

</xml_diff>